<commit_message>
Simplify Artefact ask to a single ~6 ft Glowberry tier.
Update form paste, submission brief, and canonical brief so the quote
focus is one outdoor-capable size (~1.8 m), not three tiers.

Co-authored-by: Cursor <cursoragent@cursor.com>
</commit_message>
<xml_diff>
--- a/docs/artefact/Glowberry_Artefact_Brief.docx
+++ b/docs/artefact/Glowberry_Artefact_Brief.docx
@@ -2,7 +2,7 @@
 <file path=word/document.xml><?xml version="1.0" encoding="utf-8"?>
 <w:document xmlns:w="http://schemas.openxmlformats.org/wordprocessingml/2006/main" xmlns:m="http://schemas.openxmlformats.org/officeDocument/2006/math" xmlns:r="http://schemas.openxmlformats.org/officeDocument/2006/relationships" xmlns:o="urn:schemas-microsoft-com:office:office" xmlns:v="urn:schemas-microsoft-com:vml" xmlns:w10="urn:schemas-microsoft-com:office:word" xmlns:a="http://schemas.openxmlformats.org/drawingml/2006/main" xmlns:pic="http://schemas.openxmlformats.org/drawingml/2006/picture" xmlns:wp="http://schemas.openxmlformats.org/drawingml/2006/wordprocessingDrawing">
   <w:body>
-    <w:bookmarkStart w:id="18" w:name="glowberry-fabrication-inquiry"/>
+    <w:bookmarkStart w:id="15" w:name="glowberry-fabrication-inquiry"/>
     <w:p>
       <w:pPr>
         <w:pStyle w:val="Heading1"/>
@@ -20,7 +20,7 @@
           <w:b/>
           <w:bCs/>
         </w:rPr>
-        <w:t xml:space="preserve">Studio Artefact · feasibility &amp; rough ranges</w:t>
+        <w:t xml:space="preserve">Studio Artefact · ~6 ft translucent shell · feasibility &amp; rough range</w:t>
       </w:r>
     </w:p>
     <w:p>
@@ -114,7 +114,7 @@
           <w:i/>
           <w:iCs/>
         </w:rPr>
-        <w:t xml:space="preserve">This is a feasibility brief for ballpark ranges and materials advice. Funding is open; not a purchase order.</w:t>
+        <w:t xml:space="preserve">Feasibility brief for one size. Funding open; not a purchase order.</w:t>
       </w:r>
     </w:p>
     <w:p>
@@ -300,18 +300,18 @@
                 <w:b/>
                 <w:bCs/>
               </w:rPr>
-              <w:t xml:space="preserve">Site (outdoor)</w:t>
-            </w:r>
-          </w:p>
-        </w:tc>
-        <w:tc>
-          <w:tcPr/>
-          <w:p>
-            <w:pPr>
-              <w:pStyle w:val="Compact"/>
-            </w:pPr>
-            <w:r>
-              <w:t xml:space="preserve">TBD — reachable NL (Avalon / Fogo / Bonavista-class); coastal plateau / shore–cliff character</w:t>
+              <w:t xml:space="preserve">Site</w:t>
+            </w:r>
+          </w:p>
+        </w:tc>
+        <w:tc>
+          <w:tcPr/>
+          <w:p>
+            <w:pPr>
+              <w:pStyle w:val="Compact"/>
+            </w:pPr>
+            <w:r>
+              <w:t xml:space="preserve">TBD — reachable NL (Avalon / Fogo / Bonavista-class); coastal plateau character</w:t>
             </w:r>
           </w:p>
         </w:tc>
@@ -398,7 +398,7 @@
           <w:b/>
           <w:bCs/>
         </w:rPr>
-        <w:t xml:space="preserve">References in spirit (not to copy):</w:t>
+        <w:t xml:space="preserve">References in spirit:</w:t>
       </w:r>
       <w:r>
         <w:t xml:space="preserve"> </w:t>
@@ -436,7 +436,7 @@
         <w:t xml:space="preserve"> </w:t>
       </w:r>
       <w:r>
-        <w:t xml:space="preserve">(public touchable body) — executed as</w:t>
+        <w:t xml:space="preserve">(public touchable body) — as</w:t>
       </w:r>
       <w:r>
         <w:t xml:space="preserve"> </w:t>
@@ -460,13 +460,13 @@
       </w:r>
     </w:p>
     <w:bookmarkEnd w:id="9"/>
-    <w:bookmarkStart w:id="10" w:name="look-build-intent"/>
+    <w:bookmarkStart w:id="10" w:name="this-ask-one-size"/>
     <w:p>
       <w:pPr>
         <w:pStyle w:val="Heading2"/>
       </w:pPr>
       <w:r>
-        <w:t xml:space="preserve">2. Look &amp; build intent</w:t>
+        <w:t xml:space="preserve">2. This ask — one size</w:t>
       </w:r>
     </w:p>
     <w:p>
@@ -478,13 +478,15 @@
           <w:b/>
           <w:bCs/>
         </w:rPr>
-        <w:t xml:space="preserve">Target:</w:t>
-      </w:r>
-      <w:r>
-        <w:t xml:space="preserve"> </w:t>
-      </w:r>
-      <w:r>
-        <w:t xml:space="preserve">semi-opaque</w:t>
+        <w:t xml:space="preserve">Primary quote focus: ~6 ft tall (≈1.8 m / ≈1830 mm).</w:t>
+      </w:r>
+    </w:p>
+    <w:p>
+      <w:pPr>
+        <w:pStyle w:val="BodyText"/>
+      </w:pPr>
+      <w:r>
+        <w:t xml:space="preserve">Scaled uniformly from a</w:t>
       </w:r>
       <w:r>
         <w:t xml:space="preserve"> </w:t>
@@ -494,40 +496,13 @@
           <w:b/>
           <w:bCs/>
         </w:rPr>
-        <w:t xml:space="preserve">translucent glowing orange</w:t>
-      </w:r>
-      <w:r>
-        <w:t xml:space="preserve"> </w:t>
-      </w:r>
-      <w:r>
-        <w:t xml:space="preserve">(amber → vermillion).</w:t>
-      </w:r>
-    </w:p>
-    <w:p>
-      <w:pPr>
-        <w:pStyle w:val="Compact"/>
-        <w:numPr>
-          <w:ilvl w:val="0"/>
-          <w:numId w:val="1001"/>
-        </w:numPr>
-      </w:pPr>
-      <w:r>
-        <w:t xml:space="preserve">Hollow shell + internal diffusion + LEDs</w:t>
-      </w:r>
-      <w:r>
-        <w:br/>
-      </w:r>
-    </w:p>
-    <w:p>
-      <w:pPr>
-        <w:pStyle w:val="Compact"/>
-        <w:numPr>
-          <w:ilvl w:val="0"/>
-          <w:numId w:val="1001"/>
-        </w:numPr>
-      </w:pPr>
-      <w:r>
-        <w:t xml:space="preserve">Service</w:t>
+        <w:t xml:space="preserve">500 mm</w:t>
+      </w:r>
+      <w:r>
+        <w:t xml:space="preserve"> </w:t>
+      </w:r>
+      <w:r>
+        <w:t xml:space="preserve">master → scale factor</w:t>
       </w:r>
       <w:r>
         <w:t xml:space="preserve"> </w:t>
@@ -537,22 +512,174 @@
           <w:b/>
           <w:bCs/>
         </w:rPr>
-        <w:t xml:space="preserve">hatch at stem / bottom</w:t>
-      </w:r>
-      <w:r>
-        <w:br/>
-      </w:r>
-    </w:p>
-    <w:p>
-      <w:pPr>
-        <w:pStyle w:val="Compact"/>
-        <w:numPr>
-          <w:ilvl w:val="0"/>
-          <w:numId w:val="1001"/>
-        </w:numPr>
-      </w:pPr>
-      <w:r>
-        <w:t xml:space="preserve">Daytime: readable as fruit;</w:t>
+        <w:t xml:space="preserve">≈ 3.66×</w:t>
+      </w:r>
+      <w:r>
+        <w:t xml:space="preserve">.</w:t>
+      </w:r>
+    </w:p>
+    <w:tbl>
+      <w:tblPr>
+        <w:tblStyle w:val="Table"/>
+        <w:tblW w:type="pct" w:w="5000"/>
+        <w:tblLayout w:type="fixed"/>
+        <w:tblLook w:firstRow="0" w:lastRow="0" w:firstColumn="0" w:lastColumn="0" w:noHBand="0" w:noVBand="0" w:val="0000"/>
+      </w:tblPr>
+      <w:tblGrid>
+        <w:gridCol w:w="3960"/>
+        <w:gridCol w:w="3960"/>
+      </w:tblGrid>
+      <w:tr>
+        <w:tc>
+          <w:tcPr/>
+          <w:p>
+            <w:pPr>
+              <w:pStyle w:val="Compact"/>
+            </w:pPr>
+            <w:r>
+              <w:rPr>
+                <w:b/>
+                <w:bCs/>
+              </w:rPr>
+              <w:t xml:space="preserve">Role</w:t>
+            </w:r>
+          </w:p>
+        </w:tc>
+        <w:tc>
+          <w:tcPr/>
+          <w:p>
+            <w:pPr>
+              <w:pStyle w:val="Compact"/>
+            </w:pPr>
+            <w:r>
+              <w:t xml:space="preserve">Outdoor-capable pilgrimage piece (gallery loan possible)</w:t>
+            </w:r>
+          </w:p>
+        </w:tc>
+      </w:tr>
+      <w:tr>
+        <w:tc>
+          <w:tcPr/>
+          <w:p>
+            <w:pPr>
+              <w:pStyle w:val="Compact"/>
+            </w:pPr>
+            <w:r>
+              <w:rPr>
+                <w:b/>
+                <w:bCs/>
+              </w:rPr>
+              <w:t xml:space="preserve">Build</w:t>
+            </w:r>
+          </w:p>
+        </w:tc>
+        <w:tc>
+          <w:tcPr/>
+          <w:p>
+            <w:pPr>
+              <w:pStyle w:val="Compact"/>
+            </w:pPr>
+            <w:r>
+              <w:t xml:space="preserve">Hollow translucent shell + diffusion + LED hatch at stem/bottom</w:t>
+            </w:r>
+          </w:p>
+        </w:tc>
+      </w:tr>
+      <w:tr>
+        <w:tc>
+          <w:tcPr/>
+          <w:p>
+            <w:pPr>
+              <w:pStyle w:val="Compact"/>
+            </w:pPr>
+            <w:r>
+              <w:rPr>
+                <w:b/>
+                <w:bCs/>
+              </w:rPr>
+              <w:t xml:space="preserve">Printer class</w:t>
+            </w:r>
+          </w:p>
+        </w:tc>
+        <w:tc>
+          <w:tcPr/>
+          <w:p>
+            <w:pPr>
+              <w:pStyle w:val="Compact"/>
+            </w:pPr>
+            <w:r>
+              <w:t xml:space="preserve">Likely</w:t>
+            </w:r>
+            <w:r>
+              <w:t xml:space="preserve"> </w:t>
+            </w:r>
+            <w:r>
+              <w:rPr>
+                <w:b/>
+                <w:bCs/>
+              </w:rPr>
+              <w:t xml:space="preserve">20 m³</w:t>
+            </w:r>
+            <w:r>
+              <w:t xml:space="preserve"> </w:t>
+            </w:r>
+            <w:r>
+              <w:t xml:space="preserve">one-piece preferred; advise if split/join is wiser</w:t>
+            </w:r>
+          </w:p>
+        </w:tc>
+      </w:tr>
+      <w:tr>
+        <w:tc>
+          <w:tcPr/>
+          <w:p>
+            <w:pPr>
+              <w:pStyle w:val="Compact"/>
+            </w:pPr>
+            <w:r>
+              <w:rPr>
+                <w:b/>
+                <w:bCs/>
+              </w:rPr>
+              <w:t xml:space="preserve">Systems</w:t>
+            </w:r>
+          </w:p>
+        </w:tc>
+        <w:tc>
+          <w:tcPr/>
+          <w:p>
+            <w:pPr>
+              <w:pStyle w:val="Compact"/>
+            </w:pPr>
+            <w:r>
+              <w:t xml:space="preserve">LEDs / battery / solar may be</w:t>
+            </w:r>
+            <w:r>
+              <w:t xml:space="preserve"> </w:t>
+            </w:r>
+            <w:r>
+              <w:rPr>
+                <w:b/>
+                <w:bCs/>
+              </w:rPr>
+              <w:t xml:space="preserve">separate scope</w:t>
+            </w:r>
+            <w:r>
+              <w:t xml:space="preserve"> </w:t>
+            </w:r>
+            <w:r>
+              <w:t xml:space="preserve">— shell-first is fine</w:t>
+            </w:r>
+          </w:p>
+        </w:tc>
+      </w:tr>
+    </w:tbl>
+    <w:p>
+      <w:pPr>
+        <w:pStyle w:val="BodyText"/>
+      </w:pPr>
+      <w:r>
+        <w:t xml:space="preserve">Smaller gallery editions may come later;</w:t>
       </w:r>
       <w:r>
         <w:t xml:space="preserve"> </w:t>
@@ -562,22 +689,30 @@
           <w:b/>
           <w:bCs/>
         </w:rPr>
-        <w:t xml:space="preserve">night: the show</w:t>
-      </w:r>
-      <w:r>
-        <w:br/>
-      </w:r>
-    </w:p>
-    <w:p>
-      <w:pPr>
-        <w:pStyle w:val="Compact"/>
-        <w:numPr>
-          <w:ilvl w:val="0"/>
-          <w:numId w:val="1001"/>
-        </w:numPr>
-      </w:pPr>
-      <w:r>
-        <w:t xml:space="preserve">Outdoor: occasional dark nights OK</w:t>
+        <w:t xml:space="preserve">please quote the 6 ft piece only</w:t>
+      </w:r>
+      <w:r>
+        <w:t xml:space="preserve"> </w:t>
+      </w:r>
+      <w:r>
+        <w:t xml:space="preserve">for now.</w:t>
+      </w:r>
+    </w:p>
+    <w:p>
+      <w:r>
+        <w:pict>
+          <v:rect style="width:0;height:1.5pt" o:hralign="center" o:hrstd="t" o:hr="t"/>
+        </w:pict>
+      </w:r>
+    </w:p>
+    <w:bookmarkEnd w:id="10"/>
+    <w:bookmarkStart w:id="11" w:name="look-materials"/>
+    <w:p>
+      <w:pPr>
+        <w:pStyle w:val="Heading2"/>
+      </w:pPr>
+      <w:r>
+        <w:t xml:space="preserve">3. Look &amp; materials</w:t>
       </w:r>
     </w:p>
     <w:p>
@@ -589,7 +724,29 @@
           <w:b/>
           <w:bCs/>
         </w:rPr>
-        <w:t xml:space="preserve">Materials of interest</w:t>
+        <w:t xml:space="preserve">Target:</w:t>
+      </w:r>
+      <w:r>
+        <w:t xml:space="preserve"> </w:t>
+      </w:r>
+      <w:r>
+        <w:t xml:space="preserve">semi-opaque</w:t>
+      </w:r>
+      <w:r>
+        <w:t xml:space="preserve"> </w:t>
+      </w:r>
+      <w:r>
+        <w:rPr>
+          <w:b/>
+          <w:bCs/>
+        </w:rPr>
+        <w:t xml:space="preserve">translucent glowing orange</w:t>
+      </w:r>
+      <w:r>
+        <w:t xml:space="preserve"> </w:t>
+      </w:r>
+      <w:r>
+        <w:t xml:space="preserve">(amber → vermillion).</w:t>
       </w:r>
     </w:p>
     <w:tbl>
@@ -650,12 +807,6 @@
               </w:rPr>
               <w:t xml:space="preserve">PETG</w:t>
             </w:r>
-            <w:r>
-              <w:t xml:space="preserve"> </w:t>
-            </w:r>
-            <w:r>
-              <w:t xml:space="preserve">(your large-format print)</w:t>
-            </w:r>
           </w:p>
         </w:tc>
         <w:tc>
@@ -704,18 +855,18 @@
                 <w:b/>
                 <w:bCs/>
               </w:rPr>
-              <w:t xml:space="preserve">UV-stable aliphatic clear</w:t>
-            </w:r>
-          </w:p>
-        </w:tc>
-        <w:tc>
-          <w:tcPr/>
-          <w:p>
-            <w:pPr>
-              <w:pStyle w:val="Compact"/>
-            </w:pPr>
-            <w:r>
-              <w:t xml:space="preserve">Polished stainless as the body</w:t>
+              <w:t xml:space="preserve">aliphatic UV clear</w:t>
+            </w:r>
+          </w:p>
+        </w:tc>
+        <w:tc>
+          <w:tcPr/>
+          <w:p>
+            <w:pPr>
+              <w:pStyle w:val="Compact"/>
+            </w:pPr>
+            <w:r>
+              <w:t xml:space="preserve">Polished stainless body</w:t>
             </w:r>
           </w:p>
         </w:tc>
@@ -728,7 +879,7 @@
               <w:pStyle w:val="Compact"/>
             </w:pPr>
             <w:r>
-              <w:t xml:space="preserve">Or translucent</w:t>
+              <w:t xml:space="preserve">Translucent</w:t>
             </w:r>
             <w:r>
               <w:t xml:space="preserve"> </w:t>
@@ -744,7 +895,7 @@
               <w:t xml:space="preserve"> </w:t>
             </w:r>
             <w:r>
-              <w:t xml:space="preserve">handoff if print isn’t right for outdoor NL</w:t>
+              <w:t xml:space="preserve">if print isn’t right for outdoor NL</w:t>
             </w:r>
           </w:p>
         </w:tc>
@@ -763,17 +914,23 @@
         <w:pStyle w:val="BodyText"/>
       </w:pPr>
       <w:r>
+        <w:t xml:space="preserve">Daytime: readable fruit.</w:t>
+      </w:r>
+      <w:r>
+        <w:t xml:space="preserve"> </w:t>
+      </w:r>
+      <w:r>
         <w:rPr>
           <w:b/>
           <w:bCs/>
         </w:rPr>
-        <w:t xml:space="preserve">Systems (may be separate scope from shell quote)</w:t>
-      </w:r>
-      <w:r>
-        <w:br/>
-      </w:r>
-      <w:r>
-        <w:t xml:space="preserve">Gallery (≤ ~60”): AC and/or battery, ~5–8 h evenings. Outdoor (~7–10 ft): solar hidden in/under base and/or grid; ESP32-class heartbeat controller — not Raspberry Pi for v1.</w:t>
+        <w:t xml:space="preserve">Night: the show.</w:t>
+      </w:r>
+      <w:r>
+        <w:t xml:space="preserve"> </w:t>
+      </w:r>
+      <w:r>
+        <w:t xml:space="preserve">Occasional dark nights OK outdoors.</w:t>
       </w:r>
     </w:p>
     <w:p>
@@ -783,21 +940,20 @@
         </w:pict>
       </w:r>
     </w:p>
-    <w:bookmarkEnd w:id="10"/>
-    <w:bookmarkStart w:id="11" w:name="geometry-files"/>
+    <w:bookmarkEnd w:id="11"/>
+    <w:bookmarkStart w:id="12" w:name="geometry-files"/>
     <w:p>
       <w:pPr>
         <w:pStyle w:val="Heading2"/>
       </w:pPr>
       <w:r>
-        <w:t xml:space="preserve">3. Geometry &amp; files</w:t>
+        <w:t xml:space="preserve">4. Geometry &amp; files</w:t>
       </w:r>
     </w:p>
     <w:tbl>
       <w:tblPr>
         <w:tblStyle w:val="Table"/>
-        <w:tblW w:type="pct" w:w="5000"/>
-        <w:tblLayout w:type="fixed"/>
+        <w:tblW w:type="auto" w:w="0"/>
         <w:tblLook w:firstRow="0" w:lastRow="0" w:firstColumn="0" w:lastColumn="0" w:noHBand="0" w:noVBand="0" w:val="0000"/>
       </w:tblPr>
       <w:tblGrid>
@@ -868,10 +1024,7 @@
               <w:t xml:space="preserve">500 mm</w:t>
             </w:r>
             <w:r>
-              <w:t xml:space="preserve"> </w:t>
-            </w:r>
-            <w:r>
-              <w:t xml:space="preserve">tall; units</w:t>
+              <w:t xml:space="preserve">; units</w:t>
             </w:r>
             <w:r>
               <w:t xml:space="preserve"> </w:t>
@@ -884,7 +1037,64 @@
               <w:t xml:space="preserve">meters</w:t>
             </w:r>
             <w:r>
-              <w:t xml:space="preserve">; manifold / watertight</w:t>
+              <w:t xml:space="preserve">; manifold</w:t>
+            </w:r>
+          </w:p>
+        </w:tc>
+      </w:tr>
+      <w:tr>
+        <w:tc>
+          <w:tcPr/>
+          <w:p>
+            <w:pPr>
+              <w:pStyle w:val="Compact"/>
+            </w:pPr>
+            <w:r>
+              <w:rPr>
+                <w:b/>
+                <w:bCs/>
+              </w:rPr>
+              <w:t xml:space="preserve">At 6 ft</w:t>
+            </w:r>
+          </w:p>
+        </w:tc>
+        <w:tc>
+          <w:tcPr/>
+          <w:p>
+            <w:pPr>
+              <w:pStyle w:val="Compact"/>
+            </w:pPr>
+            <w:r>
+              <w:t xml:space="preserve">Height ≈</w:t>
+            </w:r>
+            <w:r>
+              <w:t xml:space="preserve"> </w:t>
+            </w:r>
+            <w:r>
+              <w:rPr>
+                <w:b/>
+                <w:bCs/>
+              </w:rPr>
+              <w:t xml:space="preserve">1830 mm</w:t>
+            </w:r>
+            <w:r>
+              <w:t xml:space="preserve">; scale ≈</w:t>
+            </w:r>
+            <w:r>
+              <w:t xml:space="preserve"> </w:t>
+            </w:r>
+            <w:r>
+              <w:rPr>
+                <w:b/>
+                <w:bCs/>
+              </w:rPr>
+              <w:t xml:space="preserve">3.66×</w:t>
+            </w:r>
+            <w:r>
+              <w:t xml:space="preserve"> </w:t>
+            </w:r>
+            <w:r>
+              <w:t xml:space="preserve">from master</w:t>
             </w:r>
           </w:p>
         </w:tc>
@@ -939,34 +1149,6 @@
                 <w:b/>
                 <w:bCs/>
               </w:rPr>
-              <w:t xml:space="preserve">Scale</w:t>
-            </w:r>
-          </w:p>
-        </w:tc>
-        <w:tc>
-          <w:tcPr/>
-          <w:p>
-            <w:pPr>
-              <w:pStyle w:val="Compact"/>
-            </w:pPr>
-            <w:r>
-              <w:t xml:space="preserve">Uniform scale from 500 mm master per tier below</w:t>
-            </w:r>
-          </w:p>
-        </w:tc>
-      </w:tr>
-      <w:tr>
-        <w:tc>
-          <w:tcPr/>
-          <w:p>
-            <w:pPr>
-              <w:pStyle w:val="Compact"/>
-            </w:pPr>
-            <w:r>
-              <w:rPr>
-                <w:b/>
-                <w:bCs/>
-              </w:rPr>
               <w:t xml:space="preserve">Colour</w:t>
             </w:r>
           </w:p>
@@ -978,7 +1160,7 @@
               <w:pStyle w:val="Compact"/>
             </w:pPr>
             <w:r>
-              <w:t xml:space="preserve">STL uncolored — translucency / LEDs are finish + systems</w:t>
+              <w:t xml:space="preserve">STL uncolored</w:t>
             </w:r>
           </w:p>
         </w:tc>
@@ -993,13 +1175,13 @@
           <w:b/>
           <w:bCs/>
         </w:rPr>
-        <w:t xml:space="preserve">Available on request (WeTransfer):</w:t>
-      </w:r>
-      <w:r>
-        <w:t xml:space="preserve"> </w:t>
-      </w:r>
-      <w:r>
-        <w:t xml:space="preserve">production STL (~484k tris), preview STL, OBJ, Blender source. Preview stills and berry photo refs accompany this PDF.</w:t>
+        <w:t xml:space="preserve">On request (WeTransfer):</w:t>
+      </w:r>
+      <w:r>
+        <w:t xml:space="preserve"> </w:t>
+      </w:r>
+      <w:r>
+        <w:t xml:space="preserve">production STL, preview STL, OBJ, Blender source. Stills + berry photo refs with this PDF.</w:t>
       </w:r>
     </w:p>
     <w:p>
@@ -1009,23 +1191,14 @@
         </w:pict>
       </w:r>
     </w:p>
-    <w:bookmarkEnd w:id="11"/>
-    <w:bookmarkStart w:id="16" w:name="please-quote-advise"/>
+    <w:bookmarkEnd w:id="12"/>
+    <w:bookmarkStart w:id="13" w:name="please-advise"/>
     <w:p>
       <w:pPr>
         <w:pStyle w:val="Heading2"/>
       </w:pPr>
       <w:r>
-        <w:t xml:space="preserve">4. Please quote / advise</w:t>
-      </w:r>
-    </w:p>
-    <w:bookmarkStart w:id="12" w:name="tier-a-2030-gallery"/>
-    <w:p>
-      <w:pPr>
-        <w:pStyle w:val="Heading3"/>
-      </w:pPr>
-      <w:r>
-        <w:t xml:space="preserve">Tier A — 20–30” (gallery)</w:t>
+        <w:t xml:space="preserve">5. Please advise</w:t>
       </w:r>
     </w:p>
     <w:p>
@@ -1033,11 +1206,11 @@
         <w:pStyle w:val="Compact"/>
         <w:numPr>
           <w:ilvl w:val="0"/>
-          <w:numId w:val="1002"/>
+          <w:numId w:val="1001"/>
         </w:numPr>
       </w:pPr>
       <w:r>
-        <w:t xml:space="preserve">Prefer</w:t>
+        <w:t xml:space="preserve">Feasibility of</w:t>
       </w:r>
       <w:r>
         <w:t xml:space="preserve"> </w:t>
@@ -1047,7 +1220,13 @@
           <w:b/>
           <w:bCs/>
         </w:rPr>
-        <w:t xml:space="preserve">one piece on 1 m³</w:t>
+        <w:t xml:space="preserve">~6 ft</w:t>
+      </w:r>
+      <w:r>
+        <w:t xml:space="preserve"> </w:t>
+      </w:r>
+      <w:r>
+        <w:t xml:space="preserve">one-piece vs split</w:t>
       </w:r>
       <w:r>
         <w:br/>
@@ -1058,11 +1237,21 @@
         <w:pStyle w:val="Compact"/>
         <w:numPr>
           <w:ilvl w:val="0"/>
-          <w:numId w:val="1002"/>
+          <w:numId w:val="1001"/>
         </w:numPr>
       </w:pPr>
       <w:r>
-        <w:t xml:space="preserve">Translucent / light-passing build + internal LED access hatch</w:t>
+        <w:rPr>
+          <w:b/>
+          <w:bCs/>
+        </w:rPr>
+        <w:t xml:space="preserve">Rough cost range</w:t>
+      </w:r>
+      <w:r>
+        <w:t xml:space="preserve"> </w:t>
+      </w:r>
+      <w:r>
+        <w:t xml:space="preserve">— translucent PETG shell + recommended outdoor translucent finish</w:t>
       </w:r>
       <w:r>
         <w:br/>
@@ -1073,21 +1262,27 @@
         <w:pStyle w:val="Compact"/>
         <w:numPr>
           <w:ilvl w:val="0"/>
-          <w:numId w:val="1002"/>
+          <w:numId w:val="1001"/>
         </w:numPr>
       </w:pPr>
       <w:r>
-        <w:t xml:space="preserve">Power: plug-in / battery (LED install optional add-on)</w:t>
-      </w:r>
-    </w:p>
-    <w:bookmarkEnd w:id="12"/>
-    <w:bookmarkStart w:id="13" w:name="tier-b-5060-gallery"/>
-    <w:p>
-      <w:pPr>
-        <w:pStyle w:val="Heading3"/>
-      </w:pPr>
-      <w:r>
-        <w:t xml:space="preserve">Tier B — 50–60” (gallery)</w:t>
+        <w:t xml:space="preserve">Wall thickness, approximate</w:t>
+      </w:r>
+      <w:r>
+        <w:t xml:space="preserve"> </w:t>
+      </w:r>
+      <w:r>
+        <w:rPr>
+          <w:b/>
+          <w:bCs/>
+        </w:rPr>
+        <w:t xml:space="preserve">mass</w:t>
+      </w:r>
+      <w:r>
+        <w:t xml:space="preserve">, hatch, anchoring for coastal NL (UV / freeze / salt)</w:t>
+      </w:r>
+      <w:r>
+        <w:br/>
       </w:r>
     </w:p>
     <w:p>
@@ -1095,11 +1290,11 @@
         <w:pStyle w:val="Compact"/>
         <w:numPr>
           <w:ilvl w:val="0"/>
-          <w:numId w:val="1003"/>
+          <w:numId w:val="1001"/>
         </w:numPr>
       </w:pPr>
       <w:r>
-        <w:t xml:space="preserve">One berry; please price</w:t>
+        <w:t xml:space="preserve">PETG + translucent coat</w:t>
       </w:r>
       <w:r>
         <w:t xml:space="preserve"> </w:t>
@@ -1109,70 +1304,13 @@
           <w:b/>
           <w:bCs/>
         </w:rPr>
-        <w:t xml:space="preserve">both</w:t>
-      </w:r>
-      <w:r>
-        <w:t xml:space="preserve">:</w:t>
-      </w:r>
-    </w:p>
-    <w:p>
-      <w:pPr>
-        <w:pStyle w:val="Compact"/>
-        <w:numPr>
-          <w:ilvl w:val="1"/>
-          <w:numId w:val="1004"/>
-        </w:numPr>
-      </w:pPr>
-      <w:r>
-        <w:t xml:space="preserve">split across</w:t>
-      </w:r>
-      <w:r>
-        <w:t xml:space="preserve"> </w:t>
-      </w:r>
-      <w:r>
-        <w:rPr>
-          <w:b/>
-          <w:bCs/>
-        </w:rPr>
-        <w:t xml:space="preserve">1 m³</w:t>
-      </w:r>
-      <w:r>
-        <w:t xml:space="preserve"> </w:t>
-      </w:r>
-      <w:r>
-        <w:t xml:space="preserve">+ join,</w:t>
-      </w:r>
-      <w:r>
-        <w:t xml:space="preserve"> </w:t>
-      </w:r>
-      <w:r>
-        <w:rPr>
-          <w:b/>
-          <w:bCs/>
-        </w:rPr>
-        <w:t xml:space="preserve">and</w:t>
-      </w:r>
-    </w:p>
-    <w:p>
-      <w:pPr>
-        <w:pStyle w:val="Compact"/>
-        <w:numPr>
-          <w:ilvl w:val="1"/>
-          <w:numId w:val="1004"/>
-        </w:numPr>
-      </w:pPr>
-      <w:r>
-        <w:t xml:space="preserve">one piece on</w:t>
-      </w:r>
-      <w:r>
-        <w:t xml:space="preserve"> </w:t>
-      </w:r>
-      <w:r>
-        <w:rPr>
-          <w:b/>
-          <w:bCs/>
-        </w:rPr>
-        <w:t xml:space="preserve">20 m³</w:t>
+        <w:t xml:space="preserve">vs</w:t>
+      </w:r>
+      <w:r>
+        <w:t xml:space="preserve"> </w:t>
+      </w:r>
+      <w:r>
+        <w:t xml:space="preserve">FRP for this size outdoors</w:t>
       </w:r>
       <w:r>
         <w:br/>
@@ -1183,21 +1321,30 @@
         <w:pStyle w:val="Compact"/>
         <w:numPr>
           <w:ilvl w:val="0"/>
-          <w:numId w:val="1003"/>
+          <w:numId w:val="1001"/>
         </w:numPr>
       </w:pPr>
       <w:r>
-        <w:t xml:space="preserve">Same translucent glow intent</w:t>
-      </w:r>
-    </w:p>
-    <w:bookmarkEnd w:id="13"/>
-    <w:bookmarkStart w:id="14" w:name="tier-c-710-ft-outdoor-landmark"/>
-    <w:p>
-      <w:pPr>
-        <w:pStyle w:val="Heading3"/>
-      </w:pPr>
-      <w:r>
-        <w:t xml:space="preserve">Tier C — ~7–10 ft (outdoor landmark)</w:t>
+        <w:t xml:space="preserve">Rough</w:t>
+      </w:r>
+      <w:r>
+        <w:t xml:space="preserve"> </w:t>
+      </w:r>
+      <w:r>
+        <w:rPr>
+          <w:b/>
+          <w:bCs/>
+        </w:rPr>
+        <w:t xml:space="preserve">timeline</w:t>
+      </w:r>
+      <w:r>
+        <w:t xml:space="preserve"> </w:t>
+      </w:r>
+      <w:r>
+        <w:t xml:space="preserve">from approved files to delivery</w:t>
+      </w:r>
+      <w:r>
+        <w:br/>
       </w:r>
     </w:p>
     <w:p>
@@ -1205,27 +1352,11 @@
         <w:pStyle w:val="Compact"/>
         <w:numPr>
           <w:ilvl w:val="0"/>
-          <w:numId w:val="1005"/>
+          <w:numId w:val="1001"/>
         </w:numPr>
       </w:pPr>
       <w:r>
-        <w:t xml:space="preserve">Prefer one piece on</w:t>
-      </w:r>
-      <w:r>
-        <w:t xml:space="preserve"> </w:t>
-      </w:r>
-      <w:r>
-        <w:rPr>
-          <w:b/>
-          <w:bCs/>
-        </w:rPr>
-        <w:t xml:space="preserve">20 m³</w:t>
-      </w:r>
-      <w:r>
-        <w:t xml:space="preserve"> </w:t>
-      </w:r>
-      <w:r>
-        <w:t xml:space="preserve">if feasible</w:t>
+        <w:t xml:space="preserve">What you need next for a firmer quote</w:t>
       </w:r>
       <w:r>
         <w:br/>
@@ -1236,155 +1367,11 @@
         <w:pStyle w:val="Compact"/>
         <w:numPr>
           <w:ilvl w:val="0"/>
-          <w:numId w:val="1005"/>
+          <w:numId w:val="1001"/>
         </w:numPr>
       </w:pPr>
       <w:r>
-        <w:t xml:space="preserve">Outdoor UV / weather; anchoring for coastal plateau; hatch for electronics</w:t>
-      </w:r>
-      <w:r>
-        <w:br/>
-      </w:r>
-    </w:p>
-    <w:p>
-      <w:pPr>
-        <w:pStyle w:val="Compact"/>
-        <w:numPr>
-          <w:ilvl w:val="0"/>
-          <w:numId w:val="1005"/>
-        </w:numPr>
-      </w:pPr>
-      <w:r>
-        <w:t xml:space="preserve">Advice: translucent PETG + clear/tinted weather face</w:t>
-      </w:r>
-      <w:r>
-        <w:t xml:space="preserve"> </w:t>
-      </w:r>
-      <w:r>
-        <w:rPr>
-          <w:b/>
-          <w:bCs/>
-        </w:rPr>
-        <w:t xml:space="preserve">vs</w:t>
-      </w:r>
-      <w:r>
-        <w:t xml:space="preserve"> </w:t>
-      </w:r>
-      <w:r>
-        <w:t xml:space="preserve">FRP; wall thickness; mass; install notes</w:t>
-      </w:r>
-      <w:r>
-        <w:br/>
-      </w:r>
-    </w:p>
-    <w:p>
-      <w:pPr>
-        <w:pStyle w:val="Compact"/>
-        <w:numPr>
-          <w:ilvl w:val="0"/>
-          <w:numId w:val="1005"/>
-        </w:numPr>
-      </w:pPr>
-      <w:r>
-        <w:t xml:space="preserve">Solar / grid may be separate — advise if you integrate LEDs or partner on power</w:t>
-      </w:r>
-    </w:p>
-    <w:bookmarkEnd w:id="14"/>
-    <w:bookmarkStart w:id="15" w:name="cross-cutting-questions"/>
-    <w:p>
-      <w:pPr>
-        <w:pStyle w:val="Heading3"/>
-      </w:pPr>
-      <w:r>
-        <w:t xml:space="preserve">Cross-cutting questions</w:t>
-      </w:r>
-    </w:p>
-    <w:p>
-      <w:pPr>
-        <w:pStyle w:val="Compact"/>
-        <w:numPr>
-          <w:ilvl w:val="0"/>
-          <w:numId w:val="1006"/>
-        </w:numPr>
-      </w:pPr>
-      <w:r>
-        <w:t xml:space="preserve">Best translucent PETG grade / wall thickness for gallery vs outdoor</w:t>
-      </w:r>
-      <w:r>
-        <w:br/>
-      </w:r>
-    </w:p>
-    <w:p>
-      <w:pPr>
-        <w:pStyle w:val="Compact"/>
-        <w:numPr>
-          <w:ilvl w:val="0"/>
-          <w:numId w:val="1006"/>
-        </w:numPr>
-      </w:pPr>
-      <w:r>
-        <w:t xml:space="preserve">Compatible</w:t>
-      </w:r>
-      <w:r>
-        <w:t xml:space="preserve"> </w:t>
-      </w:r>
-      <w:r>
-        <w:rPr>
-          <w:b/>
-          <w:bCs/>
-        </w:rPr>
-        <w:t xml:space="preserve">translucent</w:t>
-      </w:r>
-      <w:r>
-        <w:t xml:space="preserve"> </w:t>
-      </w:r>
-      <w:r>
-        <w:t xml:space="preserve">outdoor coatings that still pass light</w:t>
-      </w:r>
-      <w:r>
-        <w:br/>
-      </w:r>
-    </w:p>
-    <w:p>
-      <w:pPr>
-        <w:pStyle w:val="Compact"/>
-        <w:numPr>
-          <w:ilvl w:val="0"/>
-          <w:numId w:val="1006"/>
-        </w:numPr>
-      </w:pPr>
-      <w:r>
-        <w:t xml:space="preserve">How you prefer to handle internal ribs vs even glow (diffusion cavity)</w:t>
-      </w:r>
-      <w:r>
-        <w:br/>
-      </w:r>
-    </w:p>
-    <w:p>
-      <w:pPr>
-        <w:pStyle w:val="Compact"/>
-        <w:numPr>
-          <w:ilvl w:val="0"/>
-          <w:numId w:val="1006"/>
-        </w:numPr>
-      </w:pPr>
-      <w:r>
-        <w:t xml:space="preserve">Rough timeline from approved files to delivery for each tier</w:t>
-      </w:r>
-      <w:r>
-        <w:br/>
-      </w:r>
-    </w:p>
-    <w:p>
-      <w:pPr>
-        <w:pStyle w:val="Compact"/>
-        <w:numPr>
-          <w:ilvl w:val="0"/>
-          <w:numId w:val="1006"/>
-        </w:numPr>
-      </w:pPr>
-      <w:r>
-        <w:t xml:space="preserve">What you need next from me for a firmer quote</w:t>
+        <w:t xml:space="preserve">Optional: whether you can include or partner on internal LED install</w:t>
       </w:r>
     </w:p>
     <w:p>
@@ -1394,15 +1381,14 @@
         </w:pict>
       </w:r>
     </w:p>
-    <w:bookmarkEnd w:id="15"/>
-    <w:bookmarkEnd w:id="16"/>
-    <w:bookmarkStart w:id="17" w:name="process-note"/>
+    <w:bookmarkEnd w:id="13"/>
+    <w:bookmarkStart w:id="14" w:name="process-note"/>
     <w:p>
       <w:pPr>
         <w:pStyle w:val="Heading2"/>
       </w:pPr>
       <w:r>
-        <w:t xml:space="preserve">5. Process note</w:t>
+        <w:t xml:space="preserve">6. Process note</w:t>
       </w:r>
     </w:p>
     <w:p>
@@ -1410,7 +1396,13 @@
         <w:pStyle w:val="FirstParagraph"/>
       </w:pPr>
       <w:r>
-        <w:t xml:space="preserve">I am happy to co-design materials, hatch detail, and wall strategy with your team after an initial feasibility read. Open R&amp;D notes (concept, materials, power):</w:t>
+        <w:t xml:space="preserve">Happy to co-design materials, hatch, and wall strategy after an initial read.</w:t>
+      </w:r>
+      <w:r>
+        <w:br/>
+      </w:r>
+      <w:r>
+        <w:t xml:space="preserve">Open R&amp;D:</w:t>
       </w:r>
       <w:r>
         <w:t xml:space="preserve"> </w:t>
@@ -1453,8 +1445,8 @@
         <w:t xml:space="preserve">Montreal, QC</w:t>
       </w:r>
     </w:p>
-    <w:bookmarkEnd w:id="17"/>
-    <w:bookmarkEnd w:id="18"/>
+    <w:bookmarkEnd w:id="14"/>
+    <w:bookmarkEnd w:id="15"/>
     <w:sectPr>
       <w:footnotePr>
         <w:numRestart w:val="eachSect"/>
@@ -1565,109 +1557,6 @@
       </w:pPr>
     </w:lvl>
   </w:abstractNum>
-  <w:abstractNum w:abstractNumId="991">
-    <w:nsid w:val="0000A991"/>
-    <w:multiLevelType w:val="multilevel"/>
-    <w:lvl w:ilvl="0">
-      <w:numFmt w:val="bullet"/>
-      <w:lvlText w:val=""/>
-      <w:lvlJc w:val="left"/>
-      <w:pPr>
-        <w:ind w:left="720" w:hanging="360"/>
-      </w:pPr>
-      <w:rPr>
-        <w:rFonts w:ascii="Symbol" w:hAnsi="Symbol" w:cs="Symbol" w:hint="default"/>
-      </w:rPr>
-    </w:lvl>
-    <w:lvl w:ilvl="1">
-      <w:numFmt w:val="bullet"/>
-      <w:lvlText w:val="o"/>
-      <w:lvlJc w:val="left"/>
-      <w:pPr>
-        <w:ind w:left="1440" w:hanging="360"/>
-      </w:pPr>
-      <w:rPr>
-        <w:rFonts w:ascii="Courier New" w:hAnsi="Courier New" w:cs="Courier New" w:hint="default"/>
-      </w:rPr>
-    </w:lvl>
-    <w:lvl w:ilvl="2">
-      <w:numFmt w:val="bullet"/>
-      <w:lvlText w:val=""/>
-      <w:lvlJc w:val="left"/>
-      <w:pPr>
-        <w:ind w:left="2160" w:hanging="360"/>
-      </w:pPr>
-      <w:rPr>
-        <w:rFonts w:ascii="Wingdings" w:hAnsi="Wingdings" w:cs="Wingdings" w:hint="default"/>
-      </w:rPr>
-    </w:lvl>
-    <w:lvl w:ilvl="3">
-      <w:numFmt w:val="bullet"/>
-      <w:lvlText w:val=""/>
-      <w:lvlJc w:val="left"/>
-      <w:pPr>
-        <w:ind w:left="2880" w:hanging="360"/>
-      </w:pPr>
-      <w:rPr>
-        <w:rFonts w:ascii="Symbol" w:hAnsi="Symbol" w:cs="Symbol" w:hint="default"/>
-      </w:rPr>
-    </w:lvl>
-    <w:lvl w:ilvl="4">
-      <w:numFmt w:val="bullet"/>
-      <w:lvlText w:val="o"/>
-      <w:lvlJc w:val="left"/>
-      <w:pPr>
-        <w:ind w:left="3600" w:hanging="360"/>
-      </w:pPr>
-      <w:rPr>
-        <w:rFonts w:ascii="Courier New" w:hAnsi="Courier New" w:cs="Courier New" w:hint="default"/>
-      </w:rPr>
-    </w:lvl>
-    <w:lvl w:ilvl="5">
-      <w:numFmt w:val="bullet"/>
-      <w:lvlText w:val=""/>
-      <w:lvlJc w:val="left"/>
-      <w:pPr>
-        <w:ind w:left="4320" w:hanging="360"/>
-      </w:pPr>
-      <w:rPr>
-        <w:rFonts w:ascii="Wingdings" w:hAnsi="Wingdings" w:cs="Wingdings" w:hint="default"/>
-      </w:rPr>
-    </w:lvl>
-    <w:lvl w:ilvl="6">
-      <w:numFmt w:val="bullet"/>
-      <w:lvlText w:val=""/>
-      <w:lvlJc w:val="left"/>
-      <w:pPr>
-        <w:ind w:left="5040" w:hanging="360"/>
-      </w:pPr>
-      <w:rPr>
-        <w:rFonts w:ascii="Symbol" w:hAnsi="Symbol" w:cs="Symbol" w:hint="default"/>
-      </w:rPr>
-    </w:lvl>
-    <w:lvl w:ilvl="7">
-      <w:numFmt w:val="bullet"/>
-      <w:lvlText w:val="o"/>
-      <w:lvlJc w:val="left"/>
-      <w:pPr>
-        <w:ind w:left="5760" w:hanging="360"/>
-      </w:pPr>
-      <w:rPr>
-        <w:rFonts w:ascii="Courier New" w:hAnsi="Courier New" w:cs="Courier New" w:hint="default"/>
-      </w:rPr>
-    </w:lvl>
-    <w:lvl w:ilvl="8">
-      <w:numFmt w:val="bullet"/>
-      <w:lvlText w:val=""/>
-      <w:lvlJc w:val="left"/>
-      <w:pPr>
-        <w:ind w:left="6480" w:hanging="360"/>
-      </w:pPr>
-      <w:rPr>
-        <w:rFonts w:ascii="Wingdings" w:hAnsi="Wingdings" w:cs="Wingdings" w:hint="default"/>
-      </w:rPr>
-    </w:lvl>
-  </w:abstractNum>
   <w:abstractNum w:abstractNumId="99411">
     <w:nsid w:val="00A99411"/>
     <w:multiLevelType w:val="multilevel"/>
@@ -1757,21 +1646,6 @@
     <w:abstractNumId w:val="990"/>
   </w:num>
   <w:num w:numId="1001">
-    <w:abstractNumId w:val="991"/>
-  </w:num>
-  <w:num w:numId="1002">
-    <w:abstractNumId w:val="991"/>
-  </w:num>
-  <w:num w:numId="1003">
-    <w:abstractNumId w:val="991"/>
-  </w:num>
-  <w:num w:numId="1004">
-    <w:abstractNumId w:val="991"/>
-  </w:num>
-  <w:num w:numId="1005">
-    <w:abstractNumId w:val="991"/>
-  </w:num>
-  <w:num w:numId="1006">
     <w:abstractNumId w:val="99411"/>
     <w:lvlOverride w:ilvl="0">
       <w:startOverride w:val="1"/>

</xml_diff>